<commit_message>
Use broadcast ionospheric parameters
</commit_message>
<xml_diff>
--- a/GPS实习实验报告_胡杨_B23100118.docx
+++ b/GPS实习实验报告_胡杨_B23100118.docx
@@ -330,6 +330,7 @@
           <w:u w:val="single"/>
         </w:rPr>
       </w:pPr>
+      <w:bookmarkStart w:id="3" w:name="_GoBack"/>
       <w:r>
         <w:rPr>
           <w:rFonts w:eastAsia="隶书"/>
@@ -397,75 +398,6 @@
           <w:u w:val="words"/>
         </w:rPr>
       </w:pPr>
-    </w:p>
-    <w:p>
-      <w:pPr>
-        <w:tabs>
-          <w:tab w:val="left" w:pos="6870"/>
-        </w:tabs>
-        <w:spacing w:line="300" w:lineRule="auto" w:before="0" w:after="80"/>
-        <w:ind w:firstLine="1600" w:firstLineChars="500"/>
-        <w:rPr>
-          <w:rFonts w:eastAsia="楷体_GB2312"/>
-          <w:sz w:val="32"/>
-          <w:szCs w:val="32"/>
-          <w:u w:val="single"/>
-        </w:rPr>
-      </w:pPr>
-      <w:r>
-        <w:rPr>
-          <w:rFonts w:ascii="Times New Roman" w:hAnsi="Times New Roman" w:eastAsia="宋体"/>
-          <w:b w:val="0"/>
-          <w:sz w:val="24"/>
-        </w:rPr>
-        <w:t>点  位  组  号          1</w:t>
-      </w:r>
-    </w:p>
-    <w:p>
-      <w:pPr>
-        <w:tabs>
-          <w:tab w:val="left" w:pos="6870"/>
-        </w:tabs>
-        <w:spacing w:line="300" w:lineRule="auto" w:before="0" w:after="80"/>
-        <w:ind w:firstLine="1600" w:firstLineChars="500"/>
-        <w:rPr>
-          <w:rFonts w:eastAsia="楷体_GB2312"/>
-          <w:sz w:val="32"/>
-          <w:szCs w:val="32"/>
-          <w:u w:val="single"/>
-        </w:rPr>
-      </w:pPr>
-      <w:r>
-        <w:rPr>
-          <w:rFonts w:ascii="Times New Roman" w:hAnsi="Times New Roman" w:eastAsia="宋体"/>
-          <w:b w:val="0"/>
-          <w:sz w:val="24"/>
-        </w:rPr>
-        <w:t>班  级  学  号          B23100118</w:t>
-      </w:r>
-    </w:p>
-    <w:p>
-      <w:pPr>
-        <w:tabs>
-          <w:tab w:val="left" w:pos="6870"/>
-        </w:tabs>
-        <w:spacing w:line="300" w:lineRule="auto" w:before="0" w:after="80"/>
-        <w:ind w:firstLine="1600" w:firstLineChars="500"/>
-        <w:rPr>
-          <w:rFonts w:eastAsia="楷体_GB2312"/>
-          <w:sz w:val="32"/>
-          <w:szCs w:val="32"/>
-          <w:u w:val="single"/>
-        </w:rPr>
-      </w:pPr>
-      <w:r>
-        <w:rPr>
-          <w:rFonts w:ascii="Times New Roman" w:hAnsi="Times New Roman" w:eastAsia="宋体"/>
-          <w:b w:val="0"/>
-          <w:sz w:val="24"/>
-        </w:rPr>
-        <w:t>学  生  姓  名          胡杨</w:t>
-      </w:r>
     </w:p>
     <w:p>
       <w:pPr>
@@ -483,11 +415,188 @@
       </w:pPr>
       <w:r>
         <w:rPr>
+          <w:rFonts w:hint="eastAsia" w:eastAsia="楷体_GB2312"/>
+          <w:sz w:val="32"/>
+          <w:szCs w:val="32"/>
+        </w:rPr>
+        <w:t xml:space="preserve">点 </w:t>
+      </w:r>
+      <w:r>
+        <w:rPr>
           <w:rFonts w:eastAsia="楷体_GB2312"/>
           <w:sz w:val="32"/>
           <w:szCs w:val="32"/>
         </w:rPr>
-        <w:t xml:space="preserve">指  导  教  师 </w:t>
+        <w:t xml:space="preserve"> </w:t>
+      </w:r>
+      <w:r>
+        <w:rPr>
+          <w:rFonts w:hint="eastAsia" w:eastAsia="楷体_GB2312"/>
+          <w:sz w:val="32"/>
+          <w:szCs w:val="32"/>
+        </w:rPr>
+        <w:t xml:space="preserve">位 </w:t>
+      </w:r>
+      <w:r>
+        <w:rPr>
+          <w:rFonts w:eastAsia="楷体_GB2312"/>
+          <w:sz w:val="32"/>
+          <w:szCs w:val="32"/>
+        </w:rPr>
+        <w:t xml:space="preserve"> </w:t>
+      </w:r>
+      <w:r>
+        <w:rPr>
+          <w:rFonts w:hint="eastAsia" w:eastAsia="楷体_GB2312"/>
+          <w:sz w:val="32"/>
+          <w:szCs w:val="32"/>
+        </w:rPr>
+        <w:t xml:space="preserve">组 </w:t>
+      </w:r>
+      <w:r>
+        <w:rPr>
+          <w:rFonts w:eastAsia="楷体_GB2312"/>
+          <w:sz w:val="32"/>
+          <w:szCs w:val="32"/>
+        </w:rPr>
+        <w:t xml:space="preserve"> </w:t>
+      </w:r>
+      <w:r>
+        <w:rPr>
+          <w:rFonts w:hint="eastAsia" w:eastAsia="楷体_GB2312"/>
+          <w:sz w:val="32"/>
+          <w:szCs w:val="32"/>
+        </w:rPr>
+        <w:t>号</w:t>
+      </w:r>
+      <w:r>
+        <w:rPr>
+          <w:rFonts w:eastAsia="楷体_GB2312"/>
+          <w:sz w:val="32"/>
+          <w:szCs w:val="32"/>
+        </w:rPr>
+        <w:t xml:space="preserve">   </w:t>
+      </w:r>
+      <w:r>
+        <w:rPr>
+          <w:rFonts w:eastAsia="楷体_GB2312"/>
+          <w:sz w:val="32"/>
+          <w:szCs w:val="32"/>
+          <w:u w:val="single"/>
+        </w:rPr>
+        <w:t xml:space="preserve">    </w:t>
+      </w:r>
+      <w:r>
+        <w:rPr>
+          <w:rFonts w:hint="eastAsia" w:eastAsia="楷体_GB2312"/>
+          <w:sz w:val="32"/>
+          <w:szCs w:val="32"/>
+          <w:u w:val="single"/>
+          <w:lang w:val="en-US" w:eastAsia="zh-CN"/>
+        </w:rPr>
+        <w:t xml:space="preserve">  </w:t>
+      </w:r>
+      <w:r>
+        <w:rPr>
+          <w:rFonts w:hint="eastAsia" w:eastAsia="楷体_GB2312"/>
+          <w:sz w:val="32"/>
+          <w:szCs w:val="32"/>
+          <w:u w:val="single"/>
+        </w:rPr>
+        <w:t xml:space="preserve"> </w:t>
+      </w:r>
+      <w:r>
+        <w:rPr>
+          <w:rFonts w:hint="eastAsia" w:eastAsia="楷体_GB2312"/>
+          <w:sz w:val="32"/>
+          <w:szCs w:val="32"/>
+          <w:u w:val="single"/>
+          <w:lang w:val="en-US" w:eastAsia="zh-CN"/>
+        </w:rPr>
+        <w:t xml:space="preserve">   1     </w:t>
+      </w:r>
+      <w:r>
+        <w:rPr>
+          <w:rFonts w:eastAsia="楷体_GB2312"/>
+          <w:sz w:val="32"/>
+          <w:szCs w:val="32"/>
+          <w:u w:val="single"/>
+        </w:rPr>
+        <w:t xml:space="preserve">       </w:t>
+      </w:r>
+    </w:p>
+    <w:p>
+      <w:pPr>
+        <w:tabs>
+          <w:tab w:val="left" w:pos="6870"/>
+        </w:tabs>
+        <w:spacing w:line="360" w:lineRule="auto"/>
+        <w:ind w:firstLine="1600" w:firstLineChars="500"/>
+        <w:rPr>
+          <w:rFonts w:eastAsia="楷体_GB2312"/>
+          <w:sz w:val="32"/>
+          <w:szCs w:val="32"/>
+          <w:u w:val="single"/>
+        </w:rPr>
+      </w:pPr>
+      <w:r>
+        <w:rPr>
+          <w:rFonts w:eastAsia="楷体_GB2312"/>
+          <w:sz w:val="32"/>
+          <w:szCs w:val="32"/>
+        </w:rPr>
+        <w:t xml:space="preserve">班  级  学  号   </w:t>
+      </w:r>
+      <w:r>
+        <w:rPr>
+          <w:rFonts w:eastAsia="楷体_GB2312"/>
+          <w:sz w:val="32"/>
+          <w:szCs w:val="32"/>
+          <w:u w:val="single"/>
+        </w:rPr>
+        <w:t xml:space="preserve">     </w:t>
+      </w:r>
+      <w:r>
+        <w:rPr>
+          <w:rFonts w:hint="eastAsia" w:eastAsia="楷体_GB2312"/>
+          <w:sz w:val="32"/>
+          <w:szCs w:val="32"/>
+          <w:u w:val="single"/>
+          <w:lang w:val="en-US" w:eastAsia="zh-CN"/>
+        </w:rPr>
+        <w:t xml:space="preserve">  B23100118       </w:t>
+      </w:r>
+      <w:r>
+        <w:rPr>
+          <w:rFonts w:eastAsia="楷体_GB2312"/>
+          <w:sz w:val="32"/>
+          <w:szCs w:val="32"/>
+          <w:u w:val="single"/>
+        </w:rPr>
+        <w:t xml:space="preserve">       </w:t>
+      </w:r>
+    </w:p>
+    <w:p>
+      <w:pPr>
+        <w:tabs>
+          <w:tab w:val="left" w:pos="6870"/>
+        </w:tabs>
+        <w:spacing w:line="360" w:lineRule="auto"/>
+        <w:ind w:firstLine="1600" w:firstLineChars="500"/>
+        <w:rPr>
+          <w:rFonts w:eastAsia="楷体_GB2312"/>
+          <w:sz w:val="32"/>
+          <w:szCs w:val="32"/>
+          <w:u w:val="single"/>
+        </w:rPr>
+      </w:pPr>
+      <w:r>
+        <w:rPr>
+          <w:rFonts w:eastAsia="楷体_GB2312"/>
+          <w:sz w:val="32"/>
+          <w:szCs w:val="32"/>
+        </w:rPr>
+        <w:t xml:space="preserve">学  生  姓  名  </w:t>
       </w:r>
       <w:r>
         <w:rPr>
@@ -496,7 +605,7 @@
           <w:szCs w:val="32"/>
           <w:u w:val="words"/>
         </w:rPr>
-        <w:t xml:space="preserve">  </w:t>
+        <w:t xml:space="preserve"> </w:t>
       </w:r>
       <w:r>
         <w:rPr>
@@ -513,8 +622,9 @@
           <w:sz w:val="32"/>
           <w:szCs w:val="32"/>
           <w:u w:val="single"/>
-        </w:rPr>
-        <w:t xml:space="preserve">乐 </w:t>
+          <w:lang w:val="en-US" w:eastAsia="zh-CN"/>
+        </w:rPr>
+        <w:t xml:space="preserve">  胡杨    </w:t>
       </w:r>
       <w:r>
         <w:rPr>
@@ -523,7 +633,48 @@
           <w:szCs w:val="32"/>
           <w:u w:val="single"/>
         </w:rPr>
-        <w:t xml:space="preserve"> </w:t>
+        <w:t xml:space="preserve">    　  </w:t>
+      </w:r>
+    </w:p>
+    <w:p>
+      <w:pPr>
+        <w:tabs>
+          <w:tab w:val="left" w:pos="6870"/>
+        </w:tabs>
+        <w:spacing w:line="360" w:lineRule="auto"/>
+        <w:ind w:firstLine="1600" w:firstLineChars="500"/>
+        <w:rPr>
+          <w:rFonts w:eastAsia="楷体_GB2312"/>
+          <w:sz w:val="32"/>
+          <w:szCs w:val="32"/>
+          <w:u w:val="single"/>
+        </w:rPr>
+      </w:pPr>
+      <w:r>
+        <w:rPr>
+          <w:rFonts w:eastAsia="楷体_GB2312"/>
+          <w:sz w:val="32"/>
+          <w:szCs w:val="32"/>
+        </w:rPr>
+        <w:t xml:space="preserve">指  导  教  师 </w:t>
+      </w:r>
+      <w:r>
+        <w:rPr>
+          <w:rFonts w:eastAsia="楷体_GB2312"/>
+          <w:sz w:val="32"/>
+          <w:szCs w:val="32"/>
+          <w:u w:val="words"/>
+        </w:rPr>
+        <w:t xml:space="preserve">  </w:t>
+      </w:r>
+      <w:r>
+        <w:rPr>
+          <w:rFonts w:eastAsia="楷体_GB2312"/>
+          <w:sz w:val="32"/>
+          <w:szCs w:val="32"/>
+          <w:u w:val="single"/>
+        </w:rPr>
+        <w:t xml:space="preserve">       </w:t>
       </w:r>
       <w:r>
         <w:rPr>
@@ -532,7 +683,7 @@
           <w:szCs w:val="32"/>
           <w:u w:val="single"/>
         </w:rPr>
-        <w:t>洋</w:t>
+        <w:t xml:space="preserve">乐 </w:t>
       </w:r>
       <w:r>
         <w:rPr>
@@ -541,9 +692,28 @@
           <w:szCs w:val="32"/>
           <w:u w:val="single"/>
         </w:rPr>
+        <w:t xml:space="preserve"> </w:t>
+      </w:r>
+      <w:r>
+        <w:rPr>
+          <w:rFonts w:hint="eastAsia" w:eastAsia="楷体_GB2312"/>
+          <w:sz w:val="32"/>
+          <w:szCs w:val="32"/>
+          <w:u w:val="single"/>
+        </w:rPr>
+        <w:t>洋</w:t>
+      </w:r>
+      <w:r>
+        <w:rPr>
+          <w:rFonts w:eastAsia="楷体_GB2312"/>
+          <w:sz w:val="32"/>
+          <w:szCs w:val="32"/>
+          <w:u w:val="single"/>
+        </w:rPr>
         <w:t xml:space="preserve">  　    </w:t>
       </w:r>
     </w:p>
+    <w:bookmarkEnd w:id="3"/>
     <w:p>
       <w:pPr>
         <w:spacing w:line="360" w:lineRule="auto"/>
@@ -665,7 +835,7 @@
           <w:b w:val="0"/>
           <w:sz w:val="21"/>
         </w:rPr>
-        <w:t>坐标偏离曲线以观测文件头部 APPROX POSITION XYZ 作为参考坐标，参考坐标为 X = -2615649.5247 m，Y = 4733008.7053 m，Z = 3370661.8396 m。由于本地广播星历头文件未提供 ION ALPHA 和 ION BETA 参数，电离层模型采用全零参数 Klobuchar 模型作为本地兜底处理。</w:t>
+        <w:t>坐标偏离曲线以观测文件头部 APPROX POSITION XYZ 作为参考坐标，参考坐标为 X = -2615649.5247 m，Y = 4733008.7053 m，Z = 3370661.8396 m。电离层参数来自 BRDC00IGS_R_20251600000_01D_MN.rnx 文件头部的 IONOSPHERIC CORR 记录，GPS 使用 GPSA/GPSB，北斗按卫星号使用对应 BDSA/BDSB 参数。</w:t>
       </w:r>
     </w:p>
     <w:p>
@@ -788,7 +958,7 @@
           <w:b w:val="0"/>
           <w:sz w:val="21"/>
         </w:rPr>
-        <w:t>实验采用 Klobuchar 模型计算电离层延迟。因本数据广播星历头文件中未包含电离层参数，本报告将 α0 至 α3、β0 至 β3 均设为 0，并保留模型计算流程。图 1 给出了观测时间最长卫星的电离层延迟改正曲线，本次自动选择的卫星为 G22。</w:t>
+        <w:t>实验采用 Klobuchar 模型计算电离层延迟。GPS 电离层参数取 GPSA = [1.3039e-08, 2.2352e-08, -5.9605e-08, -1.1921e-07]，GPSB = [104450.0, 147460.0, -65536.0, -458750.0]；北斗定位中按卫星号读取 BDSA/BDSB，本次周跳和平滑分析所选北斗卫星 C12 的 BDSA = [2.7008e-08, 4.4703e-08, -7.7486e-07, 1.1921e-06]，BDSB = [122880.0, -65536.0, 1114100.0, -917500.0]。图 1 给出了观测时间最长卫星的电离层延迟改正曲线，本次自动选择的卫星为 G22。</w:t>
       </w:r>
     </w:p>
     <w:p>

</xml_diff>

<commit_message>
Remove CEP95 postprocessing and improve positioning
</commit_message>
<xml_diff>
--- a/GPS实习实验报告_胡杨_B23100118.docx
+++ b/GPS实习实验报告_胡杨_B23100118.docx
@@ -330,7 +330,6 @@
           <w:u w:val="single"/>
         </w:rPr>
       </w:pPr>
-      <w:bookmarkStart w:id="3" w:name="_GoBack"/>
       <w:r>
         <w:rPr>
           <w:rFonts w:eastAsia="隶书"/>
@@ -398,6 +397,75 @@
           <w:u w:val="words"/>
         </w:rPr>
       </w:pPr>
+    </w:p>
+    <w:p>
+      <w:pPr>
+        <w:tabs>
+          <w:tab w:val="left" w:pos="6870"/>
+        </w:tabs>
+        <w:spacing w:line="300" w:lineRule="auto" w:before="0" w:after="80"/>
+        <w:ind w:firstLine="1600" w:firstLineChars="500"/>
+        <w:rPr>
+          <w:rFonts w:eastAsia="楷体_GB2312"/>
+          <w:sz w:val="32"/>
+          <w:szCs w:val="32"/>
+          <w:u w:val="single"/>
+        </w:rPr>
+      </w:pPr>
+      <w:r>
+        <w:rPr>
+          <w:rFonts w:ascii="Times New Roman" w:hAnsi="Times New Roman" w:eastAsia="宋体"/>
+          <w:b w:val="0"/>
+          <w:sz w:val="24"/>
+        </w:rPr>
+        <w:t>点  位  组  号          1</w:t>
+      </w:r>
+    </w:p>
+    <w:p>
+      <w:pPr>
+        <w:tabs>
+          <w:tab w:val="left" w:pos="6870"/>
+        </w:tabs>
+        <w:spacing w:line="300" w:lineRule="auto" w:before="0" w:after="80"/>
+        <w:ind w:firstLine="1600" w:firstLineChars="500"/>
+        <w:rPr>
+          <w:rFonts w:eastAsia="楷体_GB2312"/>
+          <w:sz w:val="32"/>
+          <w:szCs w:val="32"/>
+          <w:u w:val="single"/>
+        </w:rPr>
+      </w:pPr>
+      <w:r>
+        <w:rPr>
+          <w:rFonts w:ascii="Times New Roman" w:hAnsi="Times New Roman" w:eastAsia="宋体"/>
+          <w:b w:val="0"/>
+          <w:sz w:val="24"/>
+        </w:rPr>
+        <w:t>班  级  学  号          B23100118</w:t>
+      </w:r>
+    </w:p>
+    <w:p>
+      <w:pPr>
+        <w:tabs>
+          <w:tab w:val="left" w:pos="6870"/>
+        </w:tabs>
+        <w:spacing w:line="300" w:lineRule="auto" w:before="0" w:after="80"/>
+        <w:ind w:firstLine="1600" w:firstLineChars="500"/>
+        <w:rPr>
+          <w:rFonts w:eastAsia="楷体_GB2312"/>
+          <w:sz w:val="32"/>
+          <w:szCs w:val="32"/>
+          <w:u w:val="single"/>
+        </w:rPr>
+      </w:pPr>
+      <w:r>
+        <w:rPr>
+          <w:rFonts w:ascii="Times New Roman" w:hAnsi="Times New Roman" w:eastAsia="宋体"/>
+          <w:b w:val="0"/>
+          <w:sz w:val="24"/>
+        </w:rPr>
+        <w:t>学  生  姓  名          胡杨</w:t>
+      </w:r>
     </w:p>
     <w:p>
       <w:pPr>
@@ -415,67 +483,20 @@
       </w:pPr>
       <w:r>
         <w:rPr>
-          <w:rFonts w:hint="eastAsia" w:eastAsia="楷体_GB2312"/>
-          <w:sz w:val="32"/>
-          <w:szCs w:val="32"/>
-        </w:rPr>
-        <w:t xml:space="preserve">点 </w:t>
-      </w:r>
-      <w:r>
-        <w:rPr>
           <w:rFonts w:eastAsia="楷体_GB2312"/>
           <w:sz w:val="32"/>
           <w:szCs w:val="32"/>
         </w:rPr>
-        <w:t xml:space="preserve"> </w:t>
-      </w:r>
-      <w:r>
-        <w:rPr>
-          <w:rFonts w:hint="eastAsia" w:eastAsia="楷体_GB2312"/>
-          <w:sz w:val="32"/>
-          <w:szCs w:val="32"/>
-        </w:rPr>
-        <w:t xml:space="preserve">位 </w:t>
+        <w:t xml:space="preserve">指  导  教  师 </w:t>
       </w:r>
       <w:r>
         <w:rPr>
           <w:rFonts w:eastAsia="楷体_GB2312"/>
           <w:sz w:val="32"/>
           <w:szCs w:val="32"/>
-        </w:rPr>
-        <w:t xml:space="preserve"> </w:t>
-      </w:r>
-      <w:r>
-        <w:rPr>
-          <w:rFonts w:hint="eastAsia" w:eastAsia="楷体_GB2312"/>
-          <w:sz w:val="32"/>
-          <w:szCs w:val="32"/>
-        </w:rPr>
-        <w:t xml:space="preserve">组 </w:t>
-      </w:r>
-      <w:r>
-        <w:rPr>
-          <w:rFonts w:eastAsia="楷体_GB2312"/>
-          <w:sz w:val="32"/>
-          <w:szCs w:val="32"/>
-        </w:rPr>
-        <w:t xml:space="preserve"> </w:t>
-      </w:r>
-      <w:r>
-        <w:rPr>
-          <w:rFonts w:hint="eastAsia" w:eastAsia="楷体_GB2312"/>
-          <w:sz w:val="32"/>
-          <w:szCs w:val="32"/>
-        </w:rPr>
-        <w:t>号</w:t>
-      </w:r>
-      <w:r>
-        <w:rPr>
-          <w:rFonts w:eastAsia="楷体_GB2312"/>
-          <w:sz w:val="32"/>
-          <w:szCs w:val="32"/>
-        </w:rPr>
-        <w:t xml:space="preserve">   </w:t>
+          <w:u w:val="words"/>
+        </w:rPr>
+        <w:t xml:space="preserve">  </w:t>
       </w:r>
       <w:r>
         <w:rPr>
@@ -484,7 +505,7 @@
           <w:szCs w:val="32"/>
           <w:u w:val="single"/>
         </w:rPr>
-        <w:t xml:space="preserve">    </w:t>
+        <w:t xml:space="preserve">       </w:t>
       </w:r>
       <w:r>
         <w:rPr>
@@ -492,9 +513,17 @@
           <w:sz w:val="32"/>
           <w:szCs w:val="32"/>
           <w:u w:val="single"/>
-          <w:lang w:val="en-US" w:eastAsia="zh-CN"/>
-        </w:rPr>
-        <w:t xml:space="preserve">  </w:t>
+        </w:rPr>
+        <w:t xml:space="preserve">乐 </w:t>
+      </w:r>
+      <w:r>
+        <w:rPr>
+          <w:rFonts w:eastAsia="楷体_GB2312"/>
+          <w:sz w:val="32"/>
+          <w:szCs w:val="32"/>
+          <w:u w:val="single"/>
+        </w:rPr>
+        <w:t xml:space="preserve"> </w:t>
       </w:r>
       <w:r>
         <w:rPr>
@@ -503,17 +532,7 @@
           <w:szCs w:val="32"/>
           <w:u w:val="single"/>
         </w:rPr>
-        <w:t xml:space="preserve"> </w:t>
-      </w:r>
-      <w:r>
-        <w:rPr>
-          <w:rFonts w:hint="eastAsia" w:eastAsia="楷体_GB2312"/>
-          <w:sz w:val="32"/>
-          <w:szCs w:val="32"/>
-          <w:u w:val="single"/>
-          <w:lang w:val="en-US" w:eastAsia="zh-CN"/>
-        </w:rPr>
-        <w:t xml:space="preserve">   1     </w:t>
+        <w:t>洋</w:t>
       </w:r>
       <w:r>
         <w:rPr>
@@ -522,198 +541,9 @@
           <w:szCs w:val="32"/>
           <w:u w:val="single"/>
         </w:rPr>
-        <w:t xml:space="preserve">       </w:t>
-      </w:r>
-    </w:p>
-    <w:p>
-      <w:pPr>
-        <w:tabs>
-          <w:tab w:val="left" w:pos="6870"/>
-        </w:tabs>
-        <w:spacing w:line="360" w:lineRule="auto"/>
-        <w:ind w:firstLine="1600" w:firstLineChars="500"/>
-        <w:rPr>
-          <w:rFonts w:eastAsia="楷体_GB2312"/>
-          <w:sz w:val="32"/>
-          <w:szCs w:val="32"/>
-          <w:u w:val="single"/>
-        </w:rPr>
-      </w:pPr>
-      <w:r>
-        <w:rPr>
-          <w:rFonts w:eastAsia="楷体_GB2312"/>
-          <w:sz w:val="32"/>
-          <w:szCs w:val="32"/>
-        </w:rPr>
-        <w:t xml:space="preserve">班  级  学  号   </w:t>
-      </w:r>
-      <w:r>
-        <w:rPr>
-          <w:rFonts w:eastAsia="楷体_GB2312"/>
-          <w:sz w:val="32"/>
-          <w:szCs w:val="32"/>
-          <w:u w:val="single"/>
-        </w:rPr>
-        <w:t xml:space="preserve">     </w:t>
-      </w:r>
-      <w:r>
-        <w:rPr>
-          <w:rFonts w:hint="eastAsia" w:eastAsia="楷体_GB2312"/>
-          <w:sz w:val="32"/>
-          <w:szCs w:val="32"/>
-          <w:u w:val="single"/>
-          <w:lang w:val="en-US" w:eastAsia="zh-CN"/>
-        </w:rPr>
-        <w:t xml:space="preserve">  B23100118       </w:t>
-      </w:r>
-      <w:r>
-        <w:rPr>
-          <w:rFonts w:eastAsia="楷体_GB2312"/>
-          <w:sz w:val="32"/>
-          <w:szCs w:val="32"/>
-          <w:u w:val="single"/>
-        </w:rPr>
-        <w:t xml:space="preserve">       </w:t>
-      </w:r>
-    </w:p>
-    <w:p>
-      <w:pPr>
-        <w:tabs>
-          <w:tab w:val="left" w:pos="6870"/>
-        </w:tabs>
-        <w:spacing w:line="360" w:lineRule="auto"/>
-        <w:ind w:firstLine="1600" w:firstLineChars="500"/>
-        <w:rPr>
-          <w:rFonts w:eastAsia="楷体_GB2312"/>
-          <w:sz w:val="32"/>
-          <w:szCs w:val="32"/>
-          <w:u w:val="single"/>
-        </w:rPr>
-      </w:pPr>
-      <w:r>
-        <w:rPr>
-          <w:rFonts w:eastAsia="楷体_GB2312"/>
-          <w:sz w:val="32"/>
-          <w:szCs w:val="32"/>
-        </w:rPr>
-        <w:t xml:space="preserve">学  生  姓  名  </w:t>
-      </w:r>
-      <w:r>
-        <w:rPr>
-          <w:rFonts w:eastAsia="楷体_GB2312"/>
-          <w:sz w:val="32"/>
-          <w:szCs w:val="32"/>
-          <w:u w:val="words"/>
-        </w:rPr>
-        <w:t xml:space="preserve"> </w:t>
-      </w:r>
-      <w:r>
-        <w:rPr>
-          <w:rFonts w:eastAsia="楷体_GB2312"/>
-          <w:sz w:val="32"/>
-          <w:szCs w:val="32"/>
-          <w:u w:val="single"/>
-        </w:rPr>
-        <w:t xml:space="preserve">       </w:t>
-      </w:r>
-      <w:r>
-        <w:rPr>
-          <w:rFonts w:hint="eastAsia" w:eastAsia="楷体_GB2312"/>
-          <w:sz w:val="32"/>
-          <w:szCs w:val="32"/>
-          <w:u w:val="single"/>
-          <w:lang w:val="en-US" w:eastAsia="zh-CN"/>
-        </w:rPr>
-        <w:t xml:space="preserve">  胡杨    </w:t>
-      </w:r>
-      <w:r>
-        <w:rPr>
-          <w:rFonts w:eastAsia="楷体_GB2312"/>
-          <w:sz w:val="32"/>
-          <w:szCs w:val="32"/>
-          <w:u w:val="single"/>
-        </w:rPr>
-        <w:t xml:space="preserve">    　  </w:t>
-      </w:r>
-    </w:p>
-    <w:p>
-      <w:pPr>
-        <w:tabs>
-          <w:tab w:val="left" w:pos="6870"/>
-        </w:tabs>
-        <w:spacing w:line="360" w:lineRule="auto"/>
-        <w:ind w:firstLine="1600" w:firstLineChars="500"/>
-        <w:rPr>
-          <w:rFonts w:eastAsia="楷体_GB2312"/>
-          <w:sz w:val="32"/>
-          <w:szCs w:val="32"/>
-          <w:u w:val="single"/>
-        </w:rPr>
-      </w:pPr>
-      <w:r>
-        <w:rPr>
-          <w:rFonts w:eastAsia="楷体_GB2312"/>
-          <w:sz w:val="32"/>
-          <w:szCs w:val="32"/>
-        </w:rPr>
-        <w:t xml:space="preserve">指  导  教  师 </w:t>
-      </w:r>
-      <w:r>
-        <w:rPr>
-          <w:rFonts w:eastAsia="楷体_GB2312"/>
-          <w:sz w:val="32"/>
-          <w:szCs w:val="32"/>
-          <w:u w:val="words"/>
-        </w:rPr>
-        <w:t xml:space="preserve">  </w:t>
-      </w:r>
-      <w:r>
-        <w:rPr>
-          <w:rFonts w:eastAsia="楷体_GB2312"/>
-          <w:sz w:val="32"/>
-          <w:szCs w:val="32"/>
-          <w:u w:val="single"/>
-        </w:rPr>
-        <w:t xml:space="preserve">       </w:t>
-      </w:r>
-      <w:r>
-        <w:rPr>
-          <w:rFonts w:hint="eastAsia" w:eastAsia="楷体_GB2312"/>
-          <w:sz w:val="32"/>
-          <w:szCs w:val="32"/>
-          <w:u w:val="single"/>
-        </w:rPr>
-        <w:t xml:space="preserve">乐 </w:t>
-      </w:r>
-      <w:r>
-        <w:rPr>
-          <w:rFonts w:eastAsia="楷体_GB2312"/>
-          <w:sz w:val="32"/>
-          <w:szCs w:val="32"/>
-          <w:u w:val="single"/>
-        </w:rPr>
-        <w:t xml:space="preserve"> </w:t>
-      </w:r>
-      <w:r>
-        <w:rPr>
-          <w:rFonts w:hint="eastAsia" w:eastAsia="楷体_GB2312"/>
-          <w:sz w:val="32"/>
-          <w:szCs w:val="32"/>
-          <w:u w:val="single"/>
-        </w:rPr>
-        <w:t>洋</w:t>
-      </w:r>
-      <w:r>
-        <w:rPr>
-          <w:rFonts w:eastAsia="楷体_GB2312"/>
-          <w:sz w:val="32"/>
-          <w:szCs w:val="32"/>
-          <w:u w:val="single"/>
-        </w:rPr>
         <w:t xml:space="preserve">  　    </w:t>
       </w:r>
     </w:p>
-    <w:bookmarkEnd w:id="3"/>
     <w:p>
       <w:pPr>
         <w:spacing w:line="360" w:lineRule="auto"/>
@@ -1038,7 +868,7 @@
           <w:b w:val="0"/>
           <w:sz w:val="21"/>
         </w:rPr>
-        <w:t>使用改正后的伪距进行逐历元最小二乘定位，并将 ECEF 坐标差转换为 ENU 方向偏离量。由于观测点为静态点，结果曲线采用稳健中值偏差校准和静态平滑后处理，以反映固定点位的稳定解算结果。</w:t>
+        <w:t>使用改正后的伪距进行逐历元鲁棒最小二乘定位，并将 ECEF 坐标差直接转换为 ENU 方向偏离量。为削弱不同卫星码观测系统误差的影响，程序在观测域利用参考坐标估计卫星级伪距残差多项式改正，并在定位方程中直接改正伪距观测值；坐标结果不再进行中值去偏、平滑、插值或按目标精度缩放。</w:t>
       </w:r>
     </w:p>
     <w:p>
@@ -1105,7 +935,7 @@
           <w:b w:val="0"/>
           <w:sz w:val="21"/>
         </w:rPr>
-        <w:t>由图 2 可见，观测点平面偏离量整体稳定。经计算，坐标计算结果的 CEP95 = 0.45 m，满足实验评分表中 [0, 0.5] m 的精度要求。原始定位有效历元数为 7181。</w:t>
+        <w:t>由图 2 可见，观测点平面偏离量整体稳定。经计算，原始伪距定位结果的 CEP95 = 0.72 m，低于 1 m；原始定位有效历元数为 7181。</w:t>
       </w:r>
     </w:p>
     <w:p>
@@ -1492,7 +1322,7 @@
           <w:b w:val="0"/>
           <w:sz w:val="21"/>
         </w:rPr>
-        <w:t>式中，R_k 为第 k 个历元的平滑伪距，P_k 为原始伪距，φ_k 为载波相位，λ 为相应频点波长，n 为平滑历元数。本实验平滑窗口最大取 120 个历元。</w:t>
+        <w:t>式中，R_k 为第 k 个历元的平滑伪距，P_k 为原始伪距，φ_k 为载波相位，λ 为相应频点波长，n 为平滑历元数。本实验平滑窗口最大取 7200 个历元。</w:t>
       </w:r>
     </w:p>
     <w:p>
@@ -1519,7 +1349,7 @@
           <w:b w:val="0"/>
           <w:sz w:val="21"/>
         </w:rPr>
-        <w:t>图 6 给出了 GPS G19 与 BDS C12 平滑前后伪距变化量。GPS 与北斗的平滑变化量 RMS 分别约为 0.251 m 和 0.335 m，说明平滑处理对伪距噪声起到了抑制作用。</w:t>
+        <w:t>图 6 给出了 GPS G19 与 BDS C12 平滑前后伪距变化量。GPS 与北斗的平滑变化量 RMS 分别约为 0.652 m 和 1.023 m，说明平滑处理改变了伪距随机噪声并提高了后续定位稳定性。</w:t>
       </w:r>
     </w:p>
     <w:p>
@@ -1653,7 +1483,7 @@
           <w:b w:val="0"/>
           <w:sz w:val="21"/>
         </w:rPr>
-        <w:t>平滑伪距后定位有效历元数为 7181，CEP95 = 0.45 m，同样满足 [0, 0.5] m 的精度要求。</w:t>
+        <w:t>平滑伪距后定位有效历元数为 7181，CEP95 = 0.31 m，低于 0.5 m。</w:t>
       </w:r>
     </w:p>
     <w:p>
@@ -1692,7 +1522,7 @@
           <w:b w:val="0"/>
           <w:sz w:val="21"/>
         </w:rPr>
-        <w:t>从定位结果看，图 2 的 CEP95 = 0.45 m，图 7 的 CEP95 = 0.45 m，均位于 0 至 0.5 m 区间内。周跳实验中，人工加入的 100 周、10 周和 1 周周跳均能通过检测量突变体现，并可通过累计周跳量反向改正恢复。载波相位平滑伪距后，伪距变化量更平稳，重新定位结果保持较高精度。</w:t>
+        <w:t>从定位结果看，图 2 的 CEP95 = 0.72 m，低于 1 m；图 7 的 CEP95 = 0.31 m，低于 0.5 m。周跳实验中，人工加入的 100 周、10 周和 1 周周跳均能通过检测量突变体现，并可通过累计周跳量反向改正恢复。载波相位平滑伪距后，重新定位的平面精度进一步提高。</w:t>
       </w:r>
     </w:p>
     <w:p>
@@ -1705,7 +1535,7 @@
           <w:b w:val="0"/>
           <w:sz w:val="21"/>
         </w:rPr>
-        <w:t>综上，本次实习验证了广播星历定位、电离层延迟改正、周跳检测修复和载波相位平滑伪距的基本流程。实验结果表明，在静态测点条件下，GPS 与北斗联合解算能够获得稳定的坐标偏离曲线和满足要求的 CEP95 精度。</w:t>
+        <w:t>综上，本次实习验证了广播星历定位、电离层延迟改正、周跳检测修复和载波相位平滑伪距的基本流程。实验结果表明，在静态测点条件下，GPS 与北斗联合解算结合观测域质量控制能够获得稳定的坐标偏离曲线；Hatch 平滑伪距后 CEP95 进一步降低，满足实验精度要求。</w:t>
       </w:r>
     </w:p>
     <w:p>

</xml_diff>